<commit_message>
docs: atualiza os dois manuais com as mudanças de hoje
Manual Funcional (v9.3): renomeia 10.3 "Mudança de Orçamento" para
"Aprovar Diferenças de Orçamento"; Concluir Etapa de Especificação
passou a mostrar valores de Business Case; refinamentos no
Detalhamento de Pendência de Contrato (Fornecedor resolvido pelo
contrato, Valor formatado, Projeto bloqueado em rateio); nova seção
11.6 "Pagamentos Pendentes de NF" (Relatório de Projetos vira 11.7);
Ferramentas de Dev > Criar Projeto de Teste documentada como carga
inicial de projetos em andamento.

Documento de Lacunas (v7.2): mesmas renomeações/atualizações nos itens
existentes (trava de tolerância +10%, timesheet/OS) + 3 novas entradas
"RESOLVIDO" para os itens acima.

Co-Authored-By: Claude Sonnet 5 <noreply@anthropic.com>
</commit_message>
<xml_diff>
--- a/docs/Documento_Lacunas_COMPASSO.docx
+++ b/docs/Documento_Lacunas_COMPASSO.docx
@@ -39,12 +39,12 @@
     </w:p>
     <w:p>
       <w:r>
-        <w:t>Versão 7.1 — 9 de setembro de 2026</w:t>
+        <w:t>Versão 7.2 — 16 de setembro de 2026</w:t>
       </w:r>
     </w:p>
     <w:p>
       <w:r>
-        <w:t>Atualizado após (v7): "Dados da Empresa Licenciada" e vigência da licença (setup bloqueante, tela "Licença Expirada", renovação por código assinado); mapa tela→módulo movido para tabela de configuração. Atualizado após (v6): parâmetro "Controle Orçamentário" (modo do trade-off da Extraordinária: Ano Fiscal / Área / Produto), tela "Validação de Trade-off Extraordinário", e "Período do Ano Fiscal" configurável. Atualizado após (v5): tela de Fechamento Ano Fiscal (fechamento formal do AF + decisão de Carryover/Hold/Cancelamento projeto a projeto, substituindo "Projetos Carry Over"); seletor de Ano Fiscal alimentado pela configuração de Anos Fiscais (não pela data); Quadro de Orçamento com linhas de contagem e Carry Over separado em "Em Andamento"/"Em Hold"; Termo de Aceite do Go-Live como pré-requisito real da conclusão. Revisões anteriores: papel PROPRIETÁRIO e Licenciamento de Módulos; permissões por atividade com 4 verbos (Consultar/Incluir/Alterar/Deletar) e ativação de RLS nas tabelas centrais de controle de acesso; Cadastro de Produtos e Produto obrigatório na demanda; Agrupamento de Orçamento por Ano Fiscal/Área/Produto com novo Quadro de Orçamento; tela de Ajuste de Orçamento; e a padronização de nomenclatura. Atualizado após (v7.1): Release 1 do módulo Contratos e Fornecedores — pagamento por Nota Fiscal com rateio entre projetos, tela "Pendências de Contratos" (lançamento por formulário, planilha e e-mail, com aprovação e anexo de NF) e escalonamento de NF pendente.</w:t>
+        <w:t>Atualizado após (v7): "Dados da Empresa Licenciada" e vigência da licença (setup bloqueante, tela "Licença Expirada", renovação por código assinado); mapa tela→módulo movido para tabela de configuração. Atualizado após (v6): parâmetro "Controle Orçamentário" (modo do trade-off da Extraordinária: Ano Fiscal / Área / Produto), tela "Validação de Trade-off Extraordinário", e "Período do Ano Fiscal" configurável. Atualizado após (v5): tela de Fechamento Ano Fiscal (fechamento formal do AF + decisão de Carryover/Hold/Cancelamento projeto a projeto, substituindo "Projetos Carry Over"); seletor de Ano Fiscal alimentado pela configuração de Anos Fiscais (não pela data); Quadro de Orçamento com linhas de contagem e Carry Over separado em "Em Andamento"/"Em Hold"; Termo de Aceite do Go-Live como pré-requisito real da conclusão. Revisões anteriores: papel PROPRIETÁRIO e Licenciamento de Módulos; permissões por atividade com 4 verbos (Consultar/Incluir/Alterar/Deletar) e ativação de RLS nas tabelas centrais de controle de acesso; Cadastro de Produtos e Produto obrigatório na demanda; Agrupamento de Orçamento por Ano Fiscal/Área/Produto com novo Quadro de Orçamento; tela de Ajuste de Orçamento; e a padronização de nomenclatura. Atualizado após (v7.1): Release 1 do módulo Contratos e Fornecedores — pagamento por Nota Fiscal com rateio entre projetos, tela "Pendências de Contratos" (lançamento por formulário, planilha e e-mail, com aprovação e anexo de NF) e escalonamento de NF pendente. Atualizado após (v7.2): cobrança de NF pendente passou a ir direto para o e-mail cadastrado do fornecedor (antes dependia de um endereço fixo configurado em Gestão do Fluxo, que nascia inativo — motivo raiz de a cobrança nunca sair); nova tela "Pagamentos Pendentes de NF" com envio manual; refinamentos no Detalhamento de Pendência de Contrato (Fornecedor resolvido pelo contrato, Valor formatado, Projeto bloqueado em rateio multi-projeto); tela "Mudança de Orçamento" renomeada para "Aprovar Diferenças de Orçamento"; e Ferramentas de Dev &gt; Criar Projeto de Teste ampliada para servir também como carga inicial de projetos em andamento.</w:t>
       </w:r>
     </w:p>
     <w:p>
@@ -217,6 +217,21 @@
       </w:r>
     </w:p>
     <w:p>
+      <w:r>
+        <w:t>✓ RESOLVIDO (Compasso, v7.2) — No Detalhamento de Pendência de Contrato, o campo "Fornecedor" passou a ser resolvido a partir do contrato (nome cadastrado em vez de texto solto do e-mail), o "Valor" é exibido formatado, e o "Projeto" fica bloqueado quando a pendência tem rateio entre vários projetos.</w:t>
+      </w:r>
+    </w:p>
+    <w:p>
+      <w:r>
+        <w:t>✓ RESOLVIDO (Compasso, v7.2) — A cobrança de Nota Fiscal pendente (automática e a nova tela "Pagamentos Pendentes de NF", com envio manual) vai direto para o e-mail cadastrado do fornecedor, em vez de depender de um endereço fixo interno configurado em Gestão do Fluxo (que nascia inativo).</w:t>
+      </w:r>
+    </w:p>
+    <w:p>
+      <w:r>
+        <w:t>✓ RESOLVIDO (Compasso, v7.2) — Ferramentas de Dev &gt; Criar Projeto de Teste ganhou todos os campos de Formalizar Demanda (Objetivo, Pilar/Iniciativa Estratégica, Key Results, Benefit Result, Descrição) e passou a também criar o histórico de etapas concluídas (projeto_etapas) de toda fase anterior à fase de destino — proposta explícita para servir de carga inicial de projetos reais já em andamento, não só teste descartável.</w:t>
+      </w:r>
+    </w:p>
+    <w:p>
       <w:pPr>
         <w:pStyle w:val="Heading1"/>
       </w:pPr>
@@ -261,7 +276,7 @@
     </w:p>
     <w:p>
       <w:r>
-        <w:t>MELHORADO, NÃO COMPLETO — Existe o módulo completo de Contratos e Fornecedores (contrato vinculável a vários projetos, valor por vínculo, pagamento por Nota Fiscal com rateio, staging com aprovação, anexo e escalonamento de NF, canais de entrada por formulário/planilha/e-mail). Ainda não há um controle de timesheet/OS que amarre cada lançamento de terceiro a uma ordem de serviço aprovada, nem a classificação fina dos anexos (Nota Fiscal / comprovante / outro), que hoje é registrada mas não refinada na UI.</w:t>
+        <w:t>MELHORADO, NÃO COMPLETO — Existe o módulo completo de Contratos e Fornecedores (contrato vinculável a vários projetos, valor por vínculo, pagamento por Nota Fiscal com rateio, staging com aprovação, anexo e escalonamento de NF direto ao e-mail do fornecedor, tela dedicada "Pagamentos Pendentes de NF" com cobrança manual, canais de entrada por formulário/planilha/e-mail). Ainda não há um controle de timesheet/OS que amarre cada lançamento de terceiro a uma ordem de serviço aprovada, nem a classificação fina dos anexos (Nota Fiscal / comprovante / outro), que hoje é registrada mas não refinada na UI.</w:t>
       </w:r>
     </w:p>
     <w:p>
@@ -304,12 +319,12 @@
     </w:p>
     <w:p>
       <w:r>
-        <w:t>LACUNA — O processo prevê que uma variação de orçamento acima de 10% bloqueie o avanço do projeto até nova aprovação do comitê. Hoje existe: um semáforo informativo no Financeiro; a opção "Reavaliar" no Comitê (manual); e o bloqueio por percentual configurável com liberação via "Mudança de Orçamento" (seção 10.3 do Manual) — que cobre parte do caso, mas depende do percentual estar configurado e de alguém aprovar a mudança.</w:t>
+        <w:t>LACUNA — O processo prevê que uma variação de orçamento acima de 10% bloqueie o avanço do projeto até nova aprovação do comitê. Hoje existe: um semáforo informativo no Financeiro; a opção "Reavaliar" no Comitê (manual); e o bloqueio por percentual configurável com liberação via "Aprovar Diferenças de Orçamento" (seção 10.3 do Manual) — que cobre parte do caso, mas depende do percentual estar configurado e de alguém aprovar a diferença.</w:t>
       </w:r>
     </w:p>
     <w:p>
       <w:r>
-        <w:t>Onde consultar: Financeiro; Business Case &gt; Aprovar Orçamento por Projeto; Administração &gt; Percentual de Bloqueio de Orçamento; Governança &gt; Mudança de Orçamento.</w:t>
+        <w:t>Onde consultar: Financeiro; Business Case &gt; Aprovar Orçamento por Projeto; Administração &gt; Percentual de Bloqueio de Orçamento; Governança &gt; Aprovar Diferenças de Orçamento.</w:t>
       </w:r>
     </w:p>
     <w:p>

</xml_diff>